<commit_message>
Translate Lab1 documentation to English
</commit_message>
<xml_diff>
--- a/PolyU_AAE4203_Lab_report_template.docx
+++ b/PolyU_AAE4203_Lab_report_template.docx
@@ -1325,7 +1325,7 @@
         <w:pStyle w:val="a3"/>
         <w:spacing w:before="6" w:line="288" w:lineRule="auto"/>
         <w:rPr>
-          <w:rFonts w:eastAsia="宋体"/>
+          <w:rFonts w:eastAsia="SimSun"/>
           <w:sz w:val="22"/>
           <w:lang w:eastAsia="zh-CN"/>
         </w:rPr>
@@ -1959,7 +1959,7 @@
       </w:r>
       <w:r>
         <w:rPr>
-          <w:rFonts w:eastAsia="宋体" w:hint="eastAsia"/>
+          <w:rFonts w:eastAsia="SimSun" w:hint="eastAsia"/>
           <w:lang w:eastAsia="zh-CN"/>
         </w:rPr>
         <w:t xml:space="preserve"> </w:t>
@@ -6307,7 +6307,7 @@
       <w:bookmarkEnd w:id="12"/>
       <w:r>
         <w:rPr>
-          <w:rFonts w:eastAsia="宋体" w:hint="eastAsia"/>
+          <w:rFonts w:eastAsia="SimSun" w:hint="eastAsia"/>
           <w:color w:val="000000"/>
           <w:lang w:eastAsia="zh-CN"/>
         </w:rPr>
@@ -6341,7 +6341,7 @@
       </w:r>
       <w:r>
         <w:rPr>
-          <w:rFonts w:eastAsia="宋体" w:hint="eastAsia"/>
+          <w:rFonts w:eastAsia="SimSun" w:hint="eastAsia"/>
           <w:w w:val="105"/>
           <w:lang w:eastAsia="zh-CN"/>
         </w:rPr>
@@ -6776,7 +6776,7 @@
   <w:docDefaults>
     <w:rPrDefault>
       <w:rPr>
-        <w:rFonts w:ascii="Times New Roman" w:eastAsia="宋体" w:hAnsi="Times New Roman" w:cs="Times New Roman"/>
+        <w:rFonts w:ascii="Times New Roman" w:eastAsia="SimSun" w:hAnsi="Times New Roman" w:cs="Times New Roman"/>
         <w:lang w:val="en-US" w:eastAsia="zh-CN" w:bidi="ar-SA"/>
       </w:rPr>
     </w:rPrDefault>
@@ -7199,7 +7199,7 @@
       </w:tabs>
     </w:pPr>
     <w:rPr>
-      <w:rFonts w:ascii="宋体" w:eastAsia="宋体" w:hAnsi="宋体" w:hint="eastAsia"/>
+      <w:rFonts w:ascii="SimSun" w:eastAsia="SimSun" w:hAnsi="SimSun" w:hint="eastAsia"/>
       <w:sz w:val="24"/>
       <w:szCs w:val="24"/>
       <w:lang w:eastAsia="zh-CN"/>
@@ -7332,8 +7332,8 @@
         <a:cs typeface=""/>
         <a:font script="Jpan" typeface="ＭＳ ゴシック"/>
         <a:font script="Hang" typeface="맑은 고딕"/>
-        <a:font script="Hans" typeface="宋体"/>
-        <a:font script="Hant" typeface="新細明體"/>
+        <a:font script="Hans" typeface="SimSun"/>
+        <a:font script="Hant" typeface="PMingLiU"/>
         <a:font script="Arab" typeface="Times New Roman"/>
         <a:font script="Hebr" typeface="Times New Roman"/>
         <a:font script="Thai" typeface="Angsana New"/>
@@ -7364,10 +7364,10 @@
         <a:latin typeface="Calibri"/>
         <a:ea typeface=""/>
         <a:cs typeface=""/>
-        <a:font script="Jpan" typeface="ＭＳ 明朝"/>
+        <a:font script="Jpan" typeface="MS Mincho"/>
         <a:font script="Hang" typeface="맑은 고딕"/>
-        <a:font script="Hans" typeface="宋体"/>
-        <a:font script="Hant" typeface="新細明體"/>
+        <a:font script="Hans" typeface="SimSun"/>
+        <a:font script="Hant" typeface="PMingLiU"/>
         <a:font script="Arab" typeface="Arial"/>
         <a:font script="Hebr" typeface="Arial"/>
         <a:font script="Thai" typeface="Cordia New"/>

</xml_diff>